<commit_message>
Fill in provider details and payment schedule in contract
Co-Authored-By: Claude Sonnet 5.5 <noreply@anthropic.com>
Claude-Session: https://claude.ai/code/session_015er1r2dYZhKi2H2RWM5VqH
</commit_message>
<xml_diff>
--- a/calls/2026-10-05_contrat_jerome-gourod.docx
+++ b/calls/2026-10-05_contrat_jerome-gourod.docx
@@ -29,7 +29,7 @@
     </w:p>
     <w:p>
       <w:r>
-        <w:t>JSQUARE, [forme juridique / entreprise individuelle], immatriculée sous le numéro SIRET [SIRET], dont le siège est situé [ADRESSE], représentée par Jadi Bayam Dipanda, ci-après « le Prestataire » ;</w:t>
+        <w:t>JSQUARE, immatriculée sous le numéro SIRET 107 765 091 00015, dont le siège est situé 25 allée Mathilde, 93160 Noisy-le-Grand, représentée par Jadi Bayam Dipanda, ci-après « le Prestataire » ;</w:t>
       </w:r>
     </w:p>
     <w:p>
@@ -136,7 +136,7 @@
         <w:pStyle w:val="ListBullet"/>
       </w:pPr>
       <w:r>
-        <w:t>Période 1 : du [DATE DE DÉBUT] au [15 décembre 2026] ;</w:t>
+        <w:t>Période 1 : de la date de signature au 15 décembre 2026 ;</w:t>
       </w:r>
     </w:p>
     <w:p>
@@ -144,7 +144,7 @@
         <w:pStyle w:val="ListBullet"/>
       </w:pPr>
       <w:r>
-        <w:t>Suspension pendant les fêtes de fin d’année, du [16 décembre 2026] au [14 janvier 2027] ;</w:t>
+        <w:t>Suspension pendant les fêtes de fin d’année, du 16 décembre 2026 au 14 janvier 2027 ;</w:t>
       </w:r>
     </w:p>
     <w:p>
@@ -152,7 +152,7 @@
         <w:pStyle w:val="ListBullet"/>
       </w:pPr>
       <w:r>
-        <w:t>Période 2 : du [15 janvier 2027] au [15 février 2027].</w:t>
+        <w:t>Période 2 : du 15 janvier 2027 au 15 février 2027.</w:t>
       </w:r>
     </w:p>
     <w:p>
@@ -175,7 +175,7 @@
     </w:p>
     <w:p>
       <w:r>
-        <w:t>4.2 Engagement. Le Prestataire garantit la génération de [10] leads qualifiés sur la durée de la mission.</w:t>
+        <w:t>4.2 Engagement. Le Prestataire garantit la génération de 10 leads qualifiés sur la durée de la mission.</w:t>
       </w:r>
     </w:p>
     <w:p>
@@ -206,7 +206,7 @@
         <w:pStyle w:val="ListBullet"/>
       </w:pPr>
       <w:r>
-        <w:t>Frais de gestion : 300 € [HT / TTC – TVA non applicable, art. 293 B du CGI] par mois d’activité, soit 900 € pour les trois (3) mois.</w:t>
+        <w:t>Frais de gestion : 300 € net, TVA non applicable (art. 293 B du CGI), par mois d’activité, soit 900 € pour les trois (3) mois.</w:t>
       </w:r>
     </w:p>
     <w:p>
@@ -214,12 +214,12 @@
         <w:pStyle w:val="ListBullet"/>
       </w:pPr>
       <w:r>
-        <w:t>Forfait montage vidéo : 100 € [HT / TTC], payable une seule fois avec la première mensualité.</w:t>
+        <w:t>Forfait montage vidéo : 100 € net, TVA non applicable (art. 293 B du CGI), payable une seule fois avec la première mensualité.</w:t>
       </w:r>
     </w:p>
     <w:p>
       <w:r>
-        <w:t>Échéancier : 1re mensualité + forfait vidéo (400 €) à la signature ; 2e mensualité le [DATE] ; 3e mensualité le [15 janvier 2027]. Paiement par lien de paiement en ligne ou virement.</w:t>
+        <w:t>Échéancier : 1re mensualité et forfait vidéo (400 €) à la date de signature ; 2e mensualité (300 €) le même jour du mois en novembre 2026 ; 3e mensualité (300 €) le même jour du mois en décembre 2026. Paiement par lien de paiement en ligne ou virement.</w:t>
       </w:r>
     </w:p>
     <w:p>
@@ -331,13 +331,13 @@
     </w:p>
     <w:p>
       <w:r>
-        <w:t>La présente lettre de mission est soumise au droit français. En cas de différend, les Parties rechercheront une solution amiable avant toute action. À défaut, le litige sera porté devant les tribunaux compétents de [VILLE].</w:t>
+        <w:t>La présente lettre de mission est soumise au droit français. En cas de différend, les Parties rechercheront une solution amiable avant toute action. À défaut, le litige sera porté devant les tribunaux compétents de Bobigny.</w:t>
       </w:r>
     </w:p>
     <w:p>
       <w:r>
         <w:br/>
-        <w:t>Fait en deux exemplaires électroniques, le [DATE].</w:t>
+        <w:t>Fait en deux exemplaires électroniques, à la date de la dernière signature.</w:t>
       </w:r>
     </w:p>
     <w:tbl>

</xml_diff>

<commit_message>
Rename CRM, add references and testimonials clause
Co-Authored-By: Claude Sonnet 5.5 <noreply@anthropic.com>
Claude-Session: https://claude.ai/code/session_015er1r2dYZhKi2H2RWM5VqH
</commit_message>
<xml_diff>
--- a/calls/2026-10-05_contrat_jerome-gourod.docx
+++ b/calls/2026-10-05_contrat_jerome-gourod.docx
@@ -102,7 +102,7 @@
         <w:pStyle w:val="ListBullet"/>
       </w:pPr>
       <w:r>
-        <w:t>CRM Lead Flow : mise à disposition d’un accès au CRM permettant la centralisation et le suivi de l’ensemble des prospects pendant la durée de la mission.</w:t>
+        <w:t>CRM : mise à disposition d’un accès au CRM permettant la centralisation et le suivi de l’ensemble des prospects pendant la durée de la mission.</w:t>
       </w:r>
     </w:p>
     <w:p>
@@ -295,7 +295,30 @@
         <w:pStyle w:val="Heading2"/>
       </w:pPr>
       <w:r>
-        <w:t>Article 8 – Résiliation</w:t>
+        <w:t>Article 8 – Références et témoignages</w:t>
+      </w:r>
+    </w:p>
+    <w:p>
+      <w:r>
+        <w:t>Le Client autorise le Prestataire à se prévaloir de la mission et des résultats obtenus (nombre de leads, performances publicitaires, évolution de l’activité) à titre de référence commerciale, notamment sur son site internet, ses réseaux sociaux, ses propositions commerciales et ses études de cas, ainsi que sous forme de témoignage écrit ou vidéo.</w:t>
+      </w:r>
+    </w:p>
+    <w:p>
+      <w:r>
+        <w:t>Le Client peut choisir que sa participation reste anonyme : dans ce cas, son nom, son image, sa marque et son réseau d’appartenance ne sont pas mentionnés, et seuls les résultats chiffrés sont utilisés. Il en informe le Prestataire par écrit. À défaut d’opposition écrite, le Prestataire peut le citer nominativement.</w:t>
+      </w:r>
+    </w:p>
+    <w:p>
+      <w:r>
+        <w:t>Dans tous les cas, le Prestataire s’interdit de divulguer les données personnelles des prospects et toute information confidentielle du Client. Cette autorisation est consentie à titre gratuit pour la durée de la mission et pour les cinq (5) années qui suivent. Le Client peut demander à tout moment l’arrêt de toute nouvelle publication le concernant.</w:t>
+      </w:r>
+    </w:p>
+    <w:p>
+      <w:pPr>
+        <w:pStyle w:val="Heading2"/>
+      </w:pPr>
+      <w:r>
+        <w:t>Article 9 – Résiliation</w:t>
       </w:r>
     </w:p>
     <w:p>
@@ -313,7 +336,7 @@
         <w:pStyle w:val="Heading2"/>
       </w:pPr>
       <w:r>
-        <w:t>Article 9 – Responsabilité</w:t>
+        <w:t>Article 10 – Responsabilité</w:t>
       </w:r>
     </w:p>
     <w:p>
@@ -326,7 +349,7 @@
         <w:pStyle w:val="Heading2"/>
       </w:pPr>
       <w:r>
-        <w:t>Article 10 – Droit applicable et litiges</w:t>
+        <w:t>Article 11 – Droit applicable et litiges</w:t>
       </w:r>
     </w:p>
     <w:p>

</xml_diff>

<commit_message>
Contract: firm commitment until 15 Feb, flexible ad budget, fix subtitle
Co-Authored-By: Claude Sonnet 5.5 <noreply@anthropic.com>
Claude-Session: https://claude.ai/code/session_015er1r2dYZhKi2H2RWM5VqH
</commit_message>
<xml_diff>
--- a/calls/2026-10-05_contrat_jerome-gourod.docx
+++ b/calls/2026-10-05_contrat_jerome-gourod.docx
@@ -16,7 +16,7 @@
         <w:jc w:val="center"/>
       </w:pPr>
       <w:r>
-        <w:t>Prestation d’acquisition de mandats immobiliers : gestion publicitaire, préqualification de leads et CRM</w:t>
+        <w:t>Prestation d’acquisition de prospects vendeurs : gestion publicitaire, préqualification de leads et CRM</w:t>
       </w:r>
     </w:p>
     <w:p>
@@ -180,7 +180,7 @@
     </w:p>
     <w:p>
       <w:r>
-        <w:t>4.3 Conditions. Cette garantie est subordonnée au respect par le Client des conditions suivantes : maintien du budget publicitaire convenu entre les Parties à l’issue de l’audit du compte publicitaire ; transmission des accès nécessaires dans les sept (7) jours suivant la signature ; absence de modification ou de suspension des campagnes sans accord préalable du Prestataire ; prise de contact avec les leads transmis dans un délai de quarante-huit (48) heures.</w:t>
+        <w:t>4.3 Conditions. Cette garantie est subordonnée au respect par le Client des conditions suivantes : respect du budget publicitaire défini d’un commun accord entre les Parties, discuté et ajusté au fil de la mission en fonction de la durée et des résultats ; transmission des accès nécessaires dans les sept (7) jours suivant la signature ; absence de modification ou de suspension des campagnes sans accord préalable du Prestataire ; prise de contact avec les leads transmis dans un délai de quarante-huit (48) heures.</w:t>
       </w:r>
     </w:p>
     <w:p>
@@ -224,7 +224,7 @@
     </w:p>
     <w:p>
       <w:r>
-        <w:t>Le budget publicitaire n’est pas inclus dans le prix. Il est réglé directement par le Client à Meta. Son montant sera défini d’un commun accord après audit de l’historique du compte publicitaire.</w:t>
+        <w:t>Le budget publicitaire n’est pas inclus dans le prix. Il est réglé directement par le Client à Meta. Son montant est discuté et ajusté d’un commun accord entre les Parties au fil de la mission, en fonction de la durée et des résultats.</w:t>
       </w:r>
     </w:p>
     <w:p>
@@ -323,7 +323,7 @@
     </w:p>
     <w:p>
       <w:r>
-        <w:t>Chaque Partie peut résilier la mission par écrit (e-mail ou courrier) moyennant un préavis de quinze (15) jours. Les sommes correspondant aux prestations réalisées jusqu’à la fin du préavis restent dues. En cas de résiliation anticipée à l’initiative du Client, la garantie prévue à l’article 4 cesse de s’appliquer.</w:t>
+        <w:t>Le Client s’engage fermement pour toute la durée de la mission. L’engagement prend fin de plein droit le 15 février 2027, sans reconduction tacite, sous réserve de la prolongation éventuelle prévue à l’article 4.4. Aucune résiliation anticipée sans motif n’est possible avant cette date, et l’intégralité des sommes prévues à l’article 5 reste due.</w:t>
       </w:r>
     </w:p>
     <w:p>

</xml_diff>

<commit_message>
Contract: January 3rd payment, exit option after month 1, data return
Co-Authored-By: Claude Sonnet 5.5 <noreply@anthropic.com>
Claude-Session: https://claude.ai/code/session_015er1r2dYZhKi2H2RWM5VqH
</commit_message>
<xml_diff>
--- a/calls/2026-10-05_contrat_jerome-gourod.docx
+++ b/calls/2026-10-05_contrat_jerome-gourod.docx
@@ -102,7 +102,7 @@
         <w:pStyle w:val="ListBullet"/>
       </w:pPr>
       <w:r>
-        <w:t>CRM : mise à disposition d’un accès au CRM permettant la centralisation et le suivi de l’ensemble des prospects pendant la durée de la mission.</w:t>
+        <w:t>CRM : mise à disposition d’un accès au CRM permettant la centralisation et le suivi de l’ensemble des prospects pendant la durée de la mission, avec restitution de l’ensemble des prospects et de leur suivi à l’échéance (article 7).</w:t>
       </w:r>
     </w:p>
     <w:p>
@@ -219,7 +219,7 @@
     </w:p>
     <w:p>
       <w:r>
-        <w:t>Échéancier : 1re mensualité et forfait vidéo (400 €) à la date de signature ; 2e mensualité (300 €) le même jour du mois en novembre 2026 ; 3e mensualité (300 €) le même jour du mois en décembre 2026. Paiement par lien de paiement en ligne ou virement.</w:t>
+        <w:t>Échéancier : 1re mensualité et forfait vidéo (400 €) à la date de signature ; 2e mensualité (300 €) le même jour du mois en novembre 2026 ; 3e mensualité (300 €) le même jour du mois en janvier 2027. Paiement par lien de paiement en ligne ou virement.</w:t>
       </w:r>
     </w:p>
     <w:p>
@@ -282,12 +282,12 @@
     </w:p>
     <w:p>
       <w:r>
-        <w:t>Dans le cadre de la mission, le Prestataire traite les données personnelles des prospects pour le compte du Client, en qualité de sous-traitant au sens de l’article 28 du RGPD. Il s’engage à : ne traiter ces données que pour l’exécution de la mission et sur instruction du Client ; en assurer la sécurité et la confidentialité ; ne pas les céder ni les réutiliser pour d’autres clients ; restituer l’ensemble des données au Client (export du CRM) puis les supprimer au terme de la mission, sauf obligation légale de conservation.</w:t>
+        <w:t>Dans le cadre de la mission, le Prestataire traite les données personnelles des prospects pour le compte du Client, en qualité de sous-traitant au sens de l’article 28 du RGPD. Il s’engage à : ne traiter ces données que pour l’exécution de la mission et sur instruction du Client ; en assurer la sécurité et la confidentialité ; ne pas les céder ni les réutiliser pour d’autres clients ; restituer au Client, dans les quinze (15) jours suivant la fin de la mission, l’ensemble des prospects et de leur suivi (statut, notes, historique des appels) au format Excel ou CSV, puis les supprimer, sauf obligation légale de conservation.</w:t>
       </w:r>
     </w:p>
     <w:p>
       <w:r>
-        <w:t>Les données des prospects restent la propriété du Client. Chaque Partie s’engage à garder confidentielles les informations de l’autre Partie dont elle a connaissance dans le cadre de la mission.</w:t>
+        <w:t>Les données des prospects restent la propriété du Client. Les modèles de messages, automatisations, scripts et méthodes du Prestataire demeurent sa propriété. Chaque Partie s’engage à garder confidentielles les informations de l’autre Partie dont elle a connaissance dans le cadre de la mission.</w:t>
       </w:r>
     </w:p>
     <w:p>
@@ -323,7 +323,12 @@
     </w:p>
     <w:p>
       <w:r>
-        <w:t>Le Client s’engage fermement pour toute la durée de la mission. L’engagement prend fin de plein droit le 15 février 2027, sans reconduction tacite, sous réserve de la prolongation éventuelle prévue à l’article 4.4. Aucune résiliation anticipée sans motif n’est possible avant cette date, et l’intégralité des sommes prévues à l’article 5 reste due.</w:t>
+        <w:t>Le Client s’engage fermement pour toute la durée de la mission. L’engagement prend fin de plein droit le 15 février 2027, sans reconduction tacite, sous réserve de la prolongation éventuelle prévue à l’article 4.4. Aucune résiliation anticipée sans motif n’est possible avant cette date, sauf la faculté de sortie prévue ci-après, et l’intégralité des sommes prévues à l’article 5 reste due.</w:t>
+      </w:r>
+    </w:p>
+    <w:p>
+      <w:r>
+        <w:t>Faculté de sortie après le premier mois. Le « premier mois » court à compter de la date à laquelle le Prestataire dispose de l’ensemble des accès aux comptes publicitaires et où les campagnes sont actives. Si, au terme de ce premier mois, aucun lead qualifié au sens de l’article 4.1 n’a été transmis au Client alors que celui-ci a respecté ses obligations (accès fournis, budget publicitaire convenu maintenu, prise de contact avec les leads sous quarante-huit heures), le Prestataire dispose d’une période d’ajustement de quinze (15) jours pour corriger les campagnes ; l’échéance de la deuxième mensualité est suspendue pendant cette période. Si aucun lead qualifié n’a été transmis à l’issue de cette période, le Client peut mettre fin à la mission par écrit, et la deuxième mensualité ainsi que la suivante ne sont alors pas dues. La première mensualité et le forfait vidéo restent acquis au Prestataire. À défaut de notification écrite du Client dans les sept (7) jours suivant la fin de la période d’ajustement, la mission se poursuit et la deuxième mensualité devient exigible.</w:t>
       </w:r>
     </w:p>
     <w:p>

</xml_diff>